<commit_message>
Fill APA title page (Faith James, COSC 647, Dr. Huang, Oct 11 2026)
Co-Authored-By: Claude Opus 4.8 <noreply@anthropic.com>
Claude-Session: https://claude.ai/code/session_01YYt7MojQdyp4NLwWKQAf5Q
</commit_message>
<xml_diff>
--- a/kali-metasploitable-lab/Kali_Metasploitable_Lab_Report_APA.docx
+++ b/kali-metasploitable-lab/Kali_Metasploitable_Lab_Report_APA.docx
@@ -97,7 +97,7 @@
           <w:sz w:val="24"/>
           <w:szCs w:val="24"/>
         </w:rPr>
-        <w:t xml:space="preserve">Student Name</w:t>
+        <w:t xml:space="preserve">Faith James</w:t>
       </w:r>
     </w:p>
     <w:p>
@@ -111,7 +111,7 @@
           <w:sz w:val="24"/>
           <w:szCs w:val="24"/>
         </w:rPr>
-        <w:t xml:space="preserve">Department of Computer Science, University Name</w:t>
+        <w:t xml:space="preserve">COSC 647</w:t>
       </w:r>
     </w:p>
     <w:p>
@@ -125,7 +125,7 @@
           <w:sz w:val="24"/>
           <w:szCs w:val="24"/>
         </w:rPr>
-        <w:t xml:space="preserve">Course Number: Course Name</w:t>
+        <w:t xml:space="preserve">Dr. Huang</w:t>
       </w:r>
     </w:p>
     <w:p>
@@ -139,21 +139,7 @@
           <w:sz w:val="24"/>
           <w:szCs w:val="24"/>
         </w:rPr>
-        <w:t xml:space="preserve">Instructor Name</w:t>
-      </w:r>
-    </w:p>
-    <w:p>
-      <w:pPr>
-        <w:spacing w:after="0" w:line="480"/>
-        <w:jc w:val="center"/>
-      </w:pPr>
-      <w:r>
-        <w:rPr>
-          <w:rFonts w:ascii="Times New Roman" w:cs="Times New Roman" w:eastAsia="Times New Roman" w:hAnsi="Times New Roman"/>
-          <w:sz w:val="24"/>
-          <w:szCs w:val="24"/>
-        </w:rPr>
-        <w:t xml:space="preserve">Due Date</w:t>
+        <w:t xml:space="preserve">October 11, 2026</w:t>
       </w:r>
     </w:p>
     <w:p>

</xml_diff>